<commit_message>
Replace Founder voice with cinematic narration
</commit_message>
<xml_diff>
--- a/company/marketing/executive-intelligence-series/ORENDALIS_EXECUTIVE_INTELLIGENCE_EPISODE_1_PRODUCTION_PACKAGE.docx
+++ b/company/marketing/executive-intelligence-series/ORENDALIS_EXECUTIVE_INTELLIGENCE_EPISODE_1_PRODUCTION_PACKAGE.docx
@@ -1590,7 +1590,7 @@
                 <w:color w:val="0B1220"/>
                 <w:sz w:val="24"/>
               </w:rPr>
-              <w:t>Founder voice. 118–124 words per minute. Calm, observant and certain. Never perform urgency; let the edit create it.</w:t>
+              <w:t>Cinematic English narrator. Calm, observant and certain. Direct each thought independently. Never perform urgency; let the edit create it.</w:t>
             </w:r>
           </w:p>
         </w:tc>
@@ -5869,7 +5869,7 @@
                 <w:color w:val="17191C"/>
                 <w:sz w:val="16"/>
               </w:rPr>
-              <w:t>Voice reference</w:t>
+              <w:t>Voice direction</w:t>
             </w:r>
           </w:p>
         </w:tc>
@@ -5896,7 +5896,7 @@
                 <w:color w:val="17191C"/>
                 <w:sz w:val="16"/>
               </w:rPr>
-              <w:t>Record two complete founder reads and one whisper-quiet read.</w:t>
+              <w:t>Build the narration as individually directed thoughts with deliberate silence.</w:t>
             </w:r>
           </w:p>
         </w:tc>
@@ -6328,7 +6328,7 @@
                 <w:color w:val="17191C"/>
                 <w:sz w:val="16"/>
               </w:rPr>
-              <w:t>Original score, action-based sound design and final founder VO.</w:t>
+              <w:t>Original score, action-based sound design and final cinematic narration.</w:t>
             </w:r>
           </w:p>
         </w:tc>
@@ -7386,7 +7386,7 @@
           <w:color w:val="17191C"/>
           <w:sz w:val="21"/>
         </w:rPr>
-        <w:t>Keep the founder voice calm, specific and free of startup language.</w:t>
+        <w:t>Keep the narrator calm, specific and free of startup language.</w:t>
       </w:r>
     </w:p>
     <w:p>

</xml_diff>